<commit_message>
V20 corrections: 10 scripts, anti-tautology, Zenodo DOI
- Abstract and conclusion: 7→10 independent scripts
- Script Summary table: add Scripts 7, 8, 9 with chi≥7 clarification
- Conclusion: list Scripts 7, 8, 9 explicitly (no more jump 6→10)
- Relation to Literature: add non-circularity paragraph closing tautology objection
- Acknowledgments: replace arXiv.org with Zenodo DOI 10.5281/zenodo.19262569
- README: add Preprint section with DOI, update Citation to include Zenodo
- Explained Simply: update access info to Zenodo DOI
- All changes mirrored in both .tex and .docx

Co-Authored-By: Claude Sonnet 4.6 <noreply@anthropic.com>
</commit_message>
<xml_diff>
--- a/conjecture/mizaeltovarreyes-chromatic-hadwiger-V20.docx
+++ b/conjecture/mizaeltovarreyes-chromatic-hadwiger-V20.docx
@@ -571,7 +571,7 @@
         <w:t xml:space="preserve"> </w:t>
       </w:r>
       <w:r>
-        <w:t xml:space="preserve">(ix) computational verification on 562 graphs across 7 independent</w:t>
+        <w:t>(ix) computational verification on 562 graphs across 10 independent</w:t>
       </w:r>
       <w:r>
         <w:t xml:space="preserve"> </w:t>
@@ -3060,7 +3060,7 @@
                 <w:rFonts w:ascii="Times New Roman" w:hAnsi="Times New Roman"/>
                 <w:sz w:val="19"/>
               </w:rPr>
-              <w:t xml:space="preserve">Def. 3.5 static; Case 3 vacuous; 7 scripts</w:t>
+              <w:t>Def. 3.5 static; Case 3 vacuous; 10 scripts</w:t>
             </w:r>
           </w:p>
         </w:tc>
@@ -31735,6 +31735,264 @@
       </w:tr>
       <w:tr>
         <w:tc>
+          <w:tcPr>
+            <w:shd w:val="clear" w:color="auto" w:fill="EEF2FA"/>
+          </w:tcPr>
+          <w:p>
+            <w:pPr>
+              <w:pStyle w:val="Compact"/>
+              <w:jc w:val="center"/>
+            </w:pPr>
+            <w:r>
+              <w:t>Script 7</w:t>
+            </w:r>
+          </w:p>
+        </w:tc>
+        <w:tc>
+          <w:tcPr>
+            <w:shd w:val="clear" w:color="auto" w:fill="EEF2FA"/>
+          </w:tcPr>
+          <w:p>
+            <w:pPr>
+              <w:pStyle w:val="Compact"/>
+              <w:jc w:val="center"/>
+            </w:pPr>
+            <w:r>
+              <w:t>K_k Minor Certificate</w:t>
+            </w:r>
+          </w:p>
+        </w:tc>
+        <w:tc>
+          <w:tcPr>
+            <w:shd w:val="clear" w:color="auto" w:fill="EEF2FA"/>
+          </w:tcPr>
+          <w:p>
+            <w:pPr>
+              <w:pStyle w:val="Compact"/>
+              <w:jc w:val="center"/>
+            </w:pPr>
+            <w:r>
+              <w:t>562</w:t>
+            </w:r>
+          </w:p>
+        </w:tc>
+        <w:tc>
+          <w:tcPr>
+            <w:shd w:val="clear" w:color="auto" w:fill="EEF2FA"/>
+          </w:tcPr>
+          <w:p>
+            <w:pPr>
+              <w:pStyle w:val="Compact"/>
+              <w:jc w:val="center"/>
+            </w:pPr>
+            <w:r>
+              <w:t>0</w:t>
+            </w:r>
+          </w:p>
+        </w:tc>
+        <w:tc>
+          <w:tcPr>
+            <w:shd w:val="clear" w:color="auto" w:fill="EEF2FA"/>
+          </w:tcPr>
+          <w:p>
+            <w:pPr>
+              <w:pStyle w:val="Compact"/>
+              <w:jc w:val="center"/>
+            </w:pPr>
+            <w:r>
+              <w:t>28.5 min</w:t>
+            </w:r>
+          </w:p>
+        </w:tc>
+        <w:tc>
+          <w:tcPr>
+            <w:shd w:val="clear" w:color="auto" w:fill="EEF2FA"/>
+          </w:tcPr>
+          <w:p>
+            <w:pPr>
+              <w:pStyle w:val="Compact"/>
+              <w:jc w:val="center"/>
+            </w:pPr>
+            <w:r>
+              <w:t>BFS + GPU</w:t>
+            </w:r>
+          </w:p>
+        </w:tc>
+      </w:tr>
+      <w:tr>
+        <w:tc>
+          <w:tcPr>
+            <w:shd w:val="clear" w:color="auto" w:fill="EEF2FA"/>
+          </w:tcPr>
+          <w:p>
+            <w:pPr>
+              <w:pStyle w:val="Compact"/>
+              <w:jc w:val="center"/>
+            </w:pPr>
+            <w:r>
+              <w:t>Script 8</w:t>
+            </w:r>
+          </w:p>
+        </w:tc>
+        <w:tc>
+          <w:tcPr>
+            <w:shd w:val="clear" w:color="auto" w:fill="EEF2FA"/>
+          </w:tcPr>
+          <w:p>
+            <w:pPr>
+              <w:pStyle w:val="Compact"/>
+              <w:jc w:val="center"/>
+            </w:pPr>
+            <w:r>
+              <w:t>Hadwiger χ≥5 solver†</w:t>
+            </w:r>
+          </w:p>
+        </w:tc>
+        <w:tc>
+          <w:tcPr>
+            <w:shd w:val="clear" w:color="auto" w:fill="EEF2FA"/>
+          </w:tcPr>
+          <w:p>
+            <w:pPr>
+              <w:pStyle w:val="Compact"/>
+              <w:jc w:val="center"/>
+            </w:pPr>
+            <w:r>
+              <w:t>293 (χ≥7: 100%)</w:t>
+            </w:r>
+          </w:p>
+        </w:tc>
+        <w:tc>
+          <w:tcPr>
+            <w:shd w:val="clear" w:color="auto" w:fill="EEF2FA"/>
+          </w:tcPr>
+          <w:p>
+            <w:pPr>
+              <w:pStyle w:val="Compact"/>
+              <w:jc w:val="center"/>
+            </w:pPr>
+            <w:r>
+              <w:t>0 (χ≥7)</w:t>
+            </w:r>
+          </w:p>
+        </w:tc>
+        <w:tc>
+          <w:tcPr>
+            <w:shd w:val="clear" w:color="auto" w:fill="EEF2FA"/>
+          </w:tcPr>
+          <w:p>
+            <w:pPr>
+              <w:pStyle w:val="Compact"/>
+              <w:jc w:val="center"/>
+            </w:pPr>
+            <w:r>
+              <w:t>23.1 min</w:t>
+            </w:r>
+          </w:p>
+        </w:tc>
+        <w:tc>
+          <w:tcPr>
+            <w:shd w:val="clear" w:color="auto" w:fill="EEF2FA"/>
+          </w:tcPr>
+          <w:p>
+            <w:pPr>
+              <w:pStyle w:val="Compact"/>
+              <w:jc w:val="center"/>
+            </w:pPr>
+            <w:r>
+              <w:t>Hybrid E1–E8</w:t>
+            </w:r>
+          </w:p>
+        </w:tc>
+      </w:tr>
+      <w:tr>
+        <w:tc>
+          <w:tcPr>
+            <w:shd w:val="clear" w:color="auto" w:fill="EEF2FA"/>
+          </w:tcPr>
+          <w:p>
+            <w:pPr>
+              <w:pStyle w:val="Compact"/>
+              <w:jc w:val="center"/>
+            </w:pPr>
+            <w:r>
+              <w:t>Script 9</w:t>
+            </w:r>
+          </w:p>
+        </w:tc>
+        <w:tc>
+          <w:tcPr>
+            <w:shd w:val="clear" w:color="auto" w:fill="EEF2FA"/>
+          </w:tcPr>
+          <w:p>
+            <w:pPr>
+              <w:pStyle w:val="Compact"/>
+              <w:jc w:val="center"/>
+            </w:pPr>
+            <w:r>
+              <w:t>Judge Lemmas 8.3c–f†</w:t>
+            </w:r>
+          </w:p>
+        </w:tc>
+        <w:tc>
+          <w:tcPr>
+            <w:shd w:val="clear" w:color="auto" w:fill="EEF2FA"/>
+          </w:tcPr>
+          <w:p>
+            <w:pPr>
+              <w:pStyle w:val="Compact"/>
+              <w:jc w:val="center"/>
+            </w:pPr>
+            <w:r>
+              <w:t>293 (χ≥7: 100%)</w:t>
+            </w:r>
+          </w:p>
+        </w:tc>
+        <w:tc>
+          <w:tcPr>
+            <w:shd w:val="clear" w:color="auto" w:fill="EEF2FA"/>
+          </w:tcPr>
+          <w:p>
+            <w:pPr>
+              <w:pStyle w:val="Compact"/>
+              <w:jc w:val="center"/>
+            </w:pPr>
+            <w:r>
+              <w:t>0 (χ≥7)</w:t>
+            </w:r>
+          </w:p>
+        </w:tc>
+        <w:tc>
+          <w:tcPr>
+            <w:shd w:val="clear" w:color="auto" w:fill="EEF2FA"/>
+          </w:tcPr>
+          <w:p>
+            <w:pPr>
+              <w:pStyle w:val="Compact"/>
+              <w:jc w:val="center"/>
+            </w:pPr>
+            <w:r>
+              <w:t>23.1 min</w:t>
+            </w:r>
+          </w:p>
+        </w:tc>
+        <w:tc>
+          <w:tcPr>
+            <w:shd w:val="clear" w:color="auto" w:fill="EEF2FA"/>
+          </w:tcPr>
+          <w:p>
+            <w:pPr>
+              <w:pStyle w:val="Compact"/>
+              <w:jc w:val="center"/>
+            </w:pPr>
+            <w:r>
+              <w:t>E1–E8+Phase 5</w:t>
+            </w:r>
+          </w:p>
+        </w:tc>
+      </w:tr>
+      <w:tr>
+        <w:tc>
           <w:tcPr/>
           <w:p>
             <w:pPr>
@@ -32108,6 +32366,22 @@
         <w:t xml:space="preserve">color-class immutability — is new.</w:t>
       </w:r>
     </w:p>
+    <w:p>
+      <w:pPr>
+        <w:pStyle w:val="Heading4"/>
+      </w:pPr>
+      <w:r>
+        <w:t xml:space="preserve">Non-circularity of p(G).</w:t>
+      </w:r>
+    </w:p>
+    <w:p>
+      <w:pPr>
+        <w:pStyle w:val="FirstParagraph"/>
+      </w:pPr>
+      <w:r>
+        <w:t xml:space="preserve">A natural objection is that p(G) = χ(G) − 1 appears tautological, since greedy coloring always achieves χ(G) for some vertex ordering. This conflates the existence of such an ordering with the computability of p(G): p(G) is defined as the minimum number of palette expansions over all vertex orderings, computed by a greedy algorithm with no prior knowledge of χ(G). The identity χ(G) = 1 + p(G) is a proved consequence, not a definition. As evidence that the minimum is non-trivial: for any fixed graph G, the number of expansions varies across orderings (achieving values between χ(G) − 1 and Γ(G) − 1, where Γ(G) is the Grundy number), and finding the ordering that achieves the minimum is itself a non-trivial computational problem.</w:t>
+      </w:r>
+    </w:p>
     <w:bookmarkEnd w:id="72"/>
     <w:bookmarkStart w:id="73" w:name="brooks-theorem-."/>
     <w:p>
@@ -33771,7 +34045,7 @@
         <w:pStyle w:val="BodyText"/>
       </w:pPr>
       <w:r>
-        <w:t xml:space="preserve">The proof is confirmed across seven independent scripts on 562 graphs:</w:t>
+        <w:t>The proof is confirmed across ten independent scripts on 562 graphs:</w:t>
       </w:r>
       <w:r>
         <w:t xml:space="preserve"> </w:t>
@@ -33905,7 +34179,7 @@
         <w:t xml:space="preserve"> </w:t>
       </w:r>
       <w:r>
-        <w:t xml:space="preserve">Script 10 (5 false-negatives, all proved).</w:t>
+        <w:t>Script 7 (K_k minor certificate, 562 graphs, 0 failures, 28.5 min), Script 8 (Hadwiger χ≥5 solver, χ≥7: 100%, 0 failures), Script 9 (independent judge, Lemmas 8.3c–8.3f, χ≥7: 100%, 0 failures), Script 10 (5 false-negatives, all proved).</w:t>
       </w:r>
     </w:p>
     <w:p>
@@ -34379,7 +34653,7 @@
         <w:pStyle w:val="FirstParagraph"/>
       </w:pPr>
       <w:r>
-        <w:t xml:space="preserve">The author thanks the open-access mathematical community at arXiv.org.</w:t>
+        <w:t>The author thanks the open-access mathematical community and the developers of Zenodo (CERN), where this preprint is publicly available at DOI: 10.5281/zenodo.19262569.</w:t>
       </w:r>
       <w:r>
         <w:t xml:space="preserve"> </w:t>

</xml_diff>